<commit_message>
step(5.7): add the portal guides library with grounded chat, citations and the outdated flag
Learned: httpResource URLs derived from two signals, action-vs-resource at conversation scale, markdown as data not innerHTML, Accept-Language interceptor coupling app and server localization, trust UI as a first-class surface, strict AOT vs generated optionals

Co-Authored-By: Claude Fable 5 <noreply@anthropic.com>
Claude-Session: https://claude.ai/code/session_01XCaaD2oSfQhWv3vNENZDue
</commit_message>
<xml_diff>
--- a/docs/deliverables/out/UserGuide.docx
+++ b/docs/deliverables/out/UserGuide.docx
@@ -237,6 +237,56 @@
           </w:p>
         </w:tc>
       </w:tr>
+      <w:tr>
+        <w:tc>
+          <w:tcPr/>
+          <w:p>
+            <w:pPr>
+              <w:pStyle w:val="Compact"/>
+              <w:jc w:val="left"/>
+            </w:pPr>
+            <w:r>
+              <w:t xml:space="preserve">0.2</w:t>
+            </w:r>
+          </w:p>
+        </w:tc>
+        <w:tc>
+          <w:tcPr/>
+          <w:p>
+            <w:pPr>
+              <w:pStyle w:val="Compact"/>
+              <w:jc w:val="left"/>
+            </w:pPr>
+            <w:r>
+              <w:t xml:space="preserve">2026-09-07</w:t>
+            </w:r>
+          </w:p>
+        </w:tc>
+        <w:tc>
+          <w:tcPr/>
+          <w:p>
+            <w:pPr>
+              <w:pStyle w:val="Compact"/>
+              <w:jc w:val="left"/>
+            </w:pPr>
+            <w:r>
+              <w:t xml:space="preserve">Abdulsalam</w:t>
+            </w:r>
+          </w:p>
+        </w:tc>
+        <w:tc>
+          <w:tcPr/>
+          <w:p>
+            <w:pPr>
+              <w:pStyle w:val="Compact"/>
+              <w:jc w:val="left"/>
+            </w:pPr>
+            <w:r>
+              <w:t xml:space="preserve">§6 renewal guides + the grounded assistant (roadmap step 5.7); glossary + coming-soon updated</w:t>
+            </w:r>
+          </w:p>
+        </w:tc>
+      </w:tr>
     </w:tbl>
     <w:p>
       <w:pPr>
@@ -1042,7 +1092,7 @@
       </w:r>
     </w:p>
     <w:bookmarkEnd w:id="25"/>
-    <w:bookmarkStart w:id="26" w:name="glossary-المسرد"/>
+    <w:bookmarkStart w:id="26" w:name="X999e85f7aa2d726bb8018c4706758fc8647bac3"/>
     <w:p>
       <w:pPr>
         <w:pStyle w:val="Heading1"/>
@@ -1057,7 +1107,300 @@
         <w:tab/>
       </w:r>
       <w:r>
-        <w:t xml:space="preserve">6. Glossary — المسرد</w:t>
+        <w:t xml:space="preserve">6. The renewal guides and the assistant — الأدلة والمساعد</w:t>
+      </w:r>
+    </w:p>
+    <w:p>
+      <w:pPr>
+        <w:pStyle w:val="RTL"/>
+      </w:pPr>
+      <w:r>
+        <w:rPr>
+          <w:bCs/>
+          <w:b/>
+        </w:rPr>
+        <w:t xml:space="preserve">الأدلة</w:t>
+      </w:r>
+      <w:r>
+        <w:t xml:space="preserve"> </w:t>
+      </w:r>
+      <w:r>
+        <w:t xml:space="preserve">مقالات موثّقة عن تجديد الوثائق الرسمية — قراءتها متاحة للجميع</w:t>
+      </w:r>
+      <w:r>
+        <w:t xml:space="preserve"> </w:t>
+      </w:r>
+      <w:r>
+        <w:rPr>
+          <w:bCs/>
+          <w:b/>
+        </w:rPr>
+        <w:t xml:space="preserve">دون حساب</w:t>
+      </w:r>
+      <w:r>
+        <w:t xml:space="preserve">. كل دليل</w:t>
+      </w:r>
+      <w:r>
+        <w:t xml:space="preserve"> </w:t>
+      </w:r>
+      <w:r>
+        <w:t xml:space="preserve">يعرض المتطلبات والرسوم والمكان والخطوات، وفوق ذلك كله تاريخ</w:t>
+      </w:r>
+      <w:r>
+        <w:t xml:space="preserve"> </w:t>
+      </w:r>
+      <w:r>
+        <w:rPr>
+          <w:bCs/>
+          <w:b/>
+        </w:rPr>
+        <w:t xml:space="preserve">آخر تحقق</w:t>
+      </w:r>
+      <w:r>
+        <w:t xml:space="preserve"> </w:t>
+      </w:r>
+      <w:r>
+        <w:t xml:space="preserve">حتى تعرف مدى حداثة</w:t>
+      </w:r>
+      <w:r>
+        <w:t xml:space="preserve"> </w:t>
+      </w:r>
+      <w:r>
+        <w:t xml:space="preserve">المعلومة. إن بدا لك أن معلومة قديمة فاضغط</w:t>
+      </w:r>
+      <w:r>
+        <w:t xml:space="preserve"> </w:t>
+      </w:r>
+      <w:r>
+        <w:rPr>
+          <w:bCs/>
+          <w:b/>
+        </w:rPr>
+        <w:t xml:space="preserve">«هل المعلومات قديمة؟ أبلغنا»</w:t>
+      </w:r>
+      <w:r>
+        <w:t xml:space="preserve"> </w:t>
+      </w:r>
+      <w:r>
+        <w:t xml:space="preserve">— يصل بلاغك للمشرف</w:t>
+      </w:r>
+      <w:r>
+        <w:t xml:space="preserve"> </w:t>
+      </w:r>
+      <w:r>
+        <w:t xml:space="preserve">دون الحاجة لتسجيل الدخول.</w:t>
+      </w:r>
+    </w:p>
+    <w:p>
+      <w:pPr>
+        <w:pStyle w:val="BodyText"/>
+      </w:pPr>
+      <w:r>
+        <w:t xml:space="preserve">Press</w:t>
+      </w:r>
+      <w:r>
+        <w:t xml:space="preserve"> </w:t>
+      </w:r>
+      <w:r>
+        <w:rPr>
+          <w:bCs/>
+          <w:b/>
+        </w:rPr>
+        <w:t xml:space="preserve">الأدلة / Guides</w:t>
+      </w:r>
+      <w:r>
+        <w:t xml:space="preserve"> </w:t>
+      </w:r>
+      <w:r>
+        <w:t xml:space="preserve">in the header — no sign-in needed. Every guide shows its</w:t>
+      </w:r>
+      <w:r>
+        <w:t xml:space="preserve"> </w:t>
+      </w:r>
+      <w:r>
+        <w:t xml:space="preserve">requirements, fees, where to go, numbered steps, and — right under the title — the</w:t>
+      </w:r>
+      <w:r>
+        <w:t xml:space="preserve"> </w:t>
+      </w:r>
+      <w:r>
+        <w:rPr>
+          <w:bCs/>
+          <w:b/>
+        </w:rPr>
+        <w:t xml:space="preserve">last</w:t>
+      </w:r>
+      <w:r>
+        <w:rPr>
+          <w:bCs/>
+          <w:b/>
+        </w:rPr>
+        <w:t xml:space="preserve"> </w:t>
+      </w:r>
+      <w:r>
+        <w:rPr>
+          <w:bCs/>
+          <w:b/>
+        </w:rPr>
+        <w:t xml:space="preserve">verified</w:t>
+      </w:r>
+      <w:r>
+        <w:t xml:space="preserve"> </w:t>
+      </w:r>
+      <w:r>
+        <w:t xml:space="preserve">date. If something looks stale, press</w:t>
+      </w:r>
+      <w:r>
+        <w:t xml:space="preserve"> </w:t>
+      </w:r>
+      <w:r>
+        <w:rPr>
+          <w:bCs/>
+          <w:b/>
+        </w:rPr>
+        <w:t xml:space="preserve">“</w:t>
+      </w:r>
+      <w:r>
+        <w:rPr>
+          <w:bCs/>
+          <w:b/>
+        </w:rPr>
+        <w:t xml:space="preserve">Outdated? Tell us</w:t>
+      </w:r>
+      <w:r>
+        <w:rPr>
+          <w:bCs/>
+          <w:b/>
+        </w:rPr>
+        <w:t xml:space="preserve">”</w:t>
+      </w:r>
+      <w:r>
+        <w:t xml:space="preserve">; your report reaches</w:t>
+      </w:r>
+      <w:r>
+        <w:t xml:space="preserve"> </w:t>
+      </w:r>
+      <w:r>
+        <w:t xml:space="preserve">the admin anonymously.</w:t>
+      </w:r>
+    </w:p>
+    <w:p>
+      <w:pPr>
+        <w:pStyle w:val="BodyText"/>
+      </w:pPr>
+      <w:r>
+        <w:rPr>
+          <w:bCs/>
+          <w:b/>
+        </w:rPr>
+        <w:t xml:space="preserve">The assistant — المساعد</w:t>
+      </w:r>
+      <w:r>
+        <w:t xml:space="preserve">: from the guide list,</w:t>
+      </w:r>
+      <w:r>
+        <w:t xml:space="preserve"> </w:t>
+      </w:r>
+      <w:r>
+        <w:rPr>
+          <w:bCs/>
+          <w:b/>
+        </w:rPr>
+        <w:t xml:space="preserve">اسأل المساعد / Ask the assistant</w:t>
+      </w:r>
+      <w:r>
+        <w:t xml:space="preserve"> </w:t>
+      </w:r>
+      <w:r>
+        <w:t xml:space="preserve">opens a</w:t>
+      </w:r>
+      <w:r>
+        <w:t xml:space="preserve"> </w:t>
+      </w:r>
+      <w:r>
+        <w:t xml:space="preserve">chat that answers</w:t>
+      </w:r>
+      <w:r>
+        <w:t xml:space="preserve"> </w:t>
+      </w:r>
+      <w:r>
+        <w:rPr>
+          <w:bCs/>
+          <w:b/>
+        </w:rPr>
+        <w:t xml:space="preserve">only from the published guides</w:t>
+      </w:r>
+      <w:r>
+        <w:t xml:space="preserve"> </w:t>
+      </w:r>
+      <w:r>
+        <w:t xml:space="preserve">(signing in is required here, because the</w:t>
+      </w:r>
+      <w:r>
+        <w:t xml:space="preserve"> </w:t>
+      </w:r>
+      <w:r>
+        <w:t xml:space="preserve">assistant uses your daily AI allowance). Every answer lists its</w:t>
+      </w:r>
+      <w:r>
+        <w:t xml:space="preserve"> </w:t>
+      </w:r>
+      <w:r>
+        <w:rPr>
+          <w:bCs/>
+          <w:b/>
+        </w:rPr>
+        <w:t xml:space="preserve">sources</w:t>
+      </w:r>
+      <w:r>
+        <w:t xml:space="preserve"> </w:t>
+      </w:r>
+      <w:r>
+        <w:t xml:space="preserve">— links straight</w:t>
+      </w:r>
+      <w:r>
+        <w:t xml:space="preserve"> </w:t>
+      </w:r>
+      <w:r>
+        <w:t xml:space="preserve">into the guides it used, each with its last-verified date. When the guides don’t contain the</w:t>
+      </w:r>
+      <w:r>
+        <w:t xml:space="preserve"> </w:t>
+      </w:r>
+      <w:r>
+        <w:t xml:space="preserve">answer, the assistant says so honestly and points you to the guide list instead of guessing —</w:t>
+      </w:r>
+      <w:r>
+        <w:t xml:space="preserve"> </w:t>
+      </w:r>
+      <w:r>
+        <w:rPr>
+          <w:bCs/>
+          <w:b/>
+        </w:rPr>
+        <w:t xml:space="preserve">an answer from outside the guides could be wrong</w:t>
+      </w:r>
+      <w:r>
+        <w:t xml:space="preserve">, and it would rather refuse than mislead.</w:t>
+      </w:r>
+    </w:p>
+    <w:bookmarkEnd w:id="26"/>
+    <w:bookmarkStart w:id="27" w:name="glossary-المسرد"/>
+    <w:p>
+      <w:pPr>
+        <w:pStyle w:val="Heading1"/>
+      </w:pPr>
+      <w:r>
+        <w:rPr>
+          <w:rStyle w:val="SectionNumber"/>
+        </w:rPr>
+        <w:t xml:space="preserve">7</w:t>
+      </w:r>
+      <w:r>
+        <w:tab/>
+      </w:r>
+      <w:r>
+        <w:t xml:space="preserve">7. Glossary — المسرد</w:t>
       </w:r>
     </w:p>
     <w:tbl>
@@ -1265,7 +1608,7 @@
               <w:jc w:val="left"/>
             </w:pPr>
             <w:r>
-              <w:t xml:space="preserve">اقتراح</w:t>
+              <w:t xml:space="preserve">الدليل</w:t>
             </w:r>
           </w:p>
         </w:tc>
@@ -1277,20 +1620,98 @@
               <w:jc w:val="left"/>
             </w:pPr>
             <w:r>
+              <w:t xml:space="preserve">Guide</w:t>
+            </w:r>
+          </w:p>
+        </w:tc>
+      </w:tr>
+      <w:tr>
+        <w:tc>
+          <w:tcPr/>
+          <w:p>
+            <w:pPr>
+              <w:pStyle w:val="Compact"/>
+              <w:jc w:val="left"/>
+            </w:pPr>
+            <w:r>
+              <w:t xml:space="preserve">آخر تحقق</w:t>
+            </w:r>
+          </w:p>
+        </w:tc>
+        <w:tc>
+          <w:tcPr/>
+          <w:p>
+            <w:pPr>
+              <w:pStyle w:val="Compact"/>
+              <w:jc w:val="left"/>
+            </w:pPr>
+            <w:r>
+              <w:t xml:space="preserve">Last verified</w:t>
+            </w:r>
+          </w:p>
+        </w:tc>
+      </w:tr>
+      <w:tr>
+        <w:tc>
+          <w:tcPr/>
+          <w:p>
+            <w:pPr>
+              <w:pStyle w:val="Compact"/>
+              <w:jc w:val="left"/>
+            </w:pPr>
+            <w:r>
+              <w:t xml:space="preserve">المصادر</w:t>
+            </w:r>
+          </w:p>
+        </w:tc>
+        <w:tc>
+          <w:tcPr/>
+          <w:p>
+            <w:pPr>
+              <w:pStyle w:val="Compact"/>
+              <w:jc w:val="left"/>
+            </w:pPr>
+            <w:r>
+              <w:t xml:space="preserve">Sources (what the assistant cites)</w:t>
+            </w:r>
+          </w:p>
+        </w:tc>
+      </w:tr>
+      <w:tr>
+        <w:tc>
+          <w:tcPr/>
+          <w:p>
+            <w:pPr>
+              <w:pStyle w:val="Compact"/>
+              <w:jc w:val="left"/>
+            </w:pPr>
+            <w:r>
+              <w:t xml:space="preserve">اقتراح</w:t>
+            </w:r>
+          </w:p>
+        </w:tc>
+        <w:tc>
+          <w:tcPr/>
+          <w:p>
+            <w:pPr>
+              <w:pStyle w:val="Compact"/>
+              <w:jc w:val="left"/>
+            </w:pPr>
+            <w:r>
               <w:t xml:space="preserve">Proposal (what the AI suggests)</w:t>
             </w:r>
           </w:p>
         </w:tc>
       </w:tr>
     </w:tbl>
-    <w:bookmarkEnd w:id="26"/>
-    <w:bookmarkStart w:id="27" w:name="coming-soon-قريبا"/>
+    <w:bookmarkEnd w:id="27"/>
+    <w:bookmarkStart w:id="28" w:name="coming-soon-قريبا"/>
     <w:p>
       <w:pPr>
         <w:pStyle w:val="Heading1"/>
       </w:pPr>
       <w:r>
-        <w:t xml:space="preserve">7. Coming soon — قريبًا</w:t>
+        <w:t xml:space="preserve">8. Coming soon — قريبًا</w:t>
       </w:r>
     </w:p>
     <w:p>
@@ -1298,16 +1719,16 @@
         <w:pStyle w:val="FirstParagraph"/>
       </w:pPr>
       <w:r>
-        <w:t xml:space="preserve">Mobile app with camera capture and push notifications (Phase 6) · renewal guides with a</w:t>
-      </w:r>
-      <w:r>
-        <w:t xml:space="preserve"> </w:t>
-      </w:r>
-      <w:r>
-        <w:t xml:space="preserve">grounded Q&amp;A assistant (Phase 5) · sharing a document securely (Phase 8).</w:t>
-      </w:r>
-    </w:p>
-    <w:bookmarkEnd w:id="27"/>
+        <w:t xml:space="preserve">Mobile app with camera capture and push notifications (Phase 6) · sharing a document securely</w:t>
+      </w:r>
+      <w:r>
+        <w:t xml:space="preserve"> </w:t>
+      </w:r>
+      <w:r>
+        <w:t xml:space="preserve">(Phase 8).</w:t>
+      </w:r>
+    </w:p>
+    <w:bookmarkEnd w:id="28"/>
     <w:sectPr>
       <w:footnotePr>
         <w:numRestart w:val="eachSect"/>

</xml_diff>